<commit_message>
fix(presupuesto): el abono mensual va a 30.000, no a 650.000
El precio estaba mal calculado en la version anterior. La bitacora decia que ARS 650.000 era '0,8%-1,5% de la liquidacion'; en realidad es 24,9%. Recalculado contra las dos bases correctas (liquidacion a marcas y facturacion total del taller), el mismo ancla da ARS 30.000.

Puesta en marcha a ARS 500.000 y precio de lista de ARS 120.000 desde el mes 13, con los primeros 12 meses a precio de lanzamiento.

Tambien sale del alcance lo que a 30.000 no se sostiene: la cuota de IA baja de USD 30 a USD 10 (a 1.550 el dolar, USD 30 son mas que el abono entero) y WhatsApp pasa a consumo real, porque a la tarifa de Meta vigente 2 avisos por OT son ~ARS 8.600/mes, el 29% del abono. La bitacora deja escrito el error y como se corrigio.
</commit_message>
<xml_diff>
--- a/docs/propuesta-abono-mensual-electrotecniref.docx
+++ b/docs/propuesta-abono-mensual-electrotecniref.docx
@@ -157,7 +157,7 @@
           <w:sz w:val="21"/>
           <w:szCs w:val="21"/>
         </w:rPr>
-        <w:t xml:space="preserve">ARS 650.000</w:t>
+        <w:t xml:space="preserve">ARS 30.000</w:t>
       </w:r>
       <w:r>
         <w:rPr>
@@ -181,7 +181,7 @@
           <w:sz w:val="21"/>
           <w:szCs w:val="21"/>
         </w:rPr>
-        <w:t xml:space="preserve">ARS 850.000</w:t>
+        <w:t xml:space="preserve">ARS 500.000</w:t>
       </w:r>
       <w:r>
         <w:rPr>
@@ -354,7 +354,7 @@
                 <w:sz w:val="20"/>
                 <w:szCs w:val="20"/>
               </w:rPr>
-              <w:t xml:space="preserve">ARS 850.000</w:t>
+              <w:t xml:space="preserve">ARS 500.000</w:t>
             </w:r>
           </w:p>
         </w:tc>
@@ -393,7 +393,7 @@
                 <w:sz w:val="20"/>
                 <w:szCs w:val="20"/>
               </w:rPr>
-              <w:t xml:space="preserve">Abono mensual base</w:t>
+              <w:t xml:space="preserve">Abono mensual base (meses 1 a 12)</w:t>
             </w:r>
           </w:p>
         </w:tc>
@@ -428,7 +428,7 @@
                 <w:sz w:val="20"/>
                 <w:szCs w:val="20"/>
               </w:rPr>
-              <w:t xml:space="preserve">ARS 650.000 / mes</w:t>
+              <w:t xml:space="preserve">ARS 30.000 / mes</w:t>
             </w:r>
           </w:p>
         </w:tc>
@@ -466,7 +466,7 @@
                 <w:sz w:val="20"/>
                 <w:szCs w:val="20"/>
               </w:rPr>
-              <w:t xml:space="preserve">Asistente con IA (incluido en el abono)</w:t>
+              <w:t xml:space="preserve">Precio de lista del abono (desde el mes 13)</w:t>
             </w:r>
           </w:p>
         </w:tc>
@@ -500,7 +500,7 @@
                 <w:sz w:val="20"/>
                 <w:szCs w:val="20"/>
               </w:rPr>
-              <w:t xml:space="preserve">Cuota de USD 30 / mes</w:t>
+              <w:t xml:space="preserve">ARS 120.000 / mes</w:t>
             </w:r>
           </w:p>
         </w:tc>
@@ -539,6 +539,79 @@
                 <w:sz w:val="20"/>
                 <w:szCs w:val="20"/>
               </w:rPr>
+              <w:t xml:space="preserve">Asistente con IA (incluido en el abono)</w:t>
+            </w:r>
+          </w:p>
+        </w:tc>
+        <w:tc>
+          <w:tcPr>
+            <w:tcW w:type="dxa" w:w="6038"/>
+            <w:tcBorders>
+              <w:top w:val="single" w:color="BFBFBF" w:sz="1"/>
+              <w:left w:val="single" w:color="BFBFBF" w:sz="1"/>
+              <w:bottom w:val="single" w:color="BFBFBF" w:sz="1"/>
+              <w:right w:val="single" w:color="BFBFBF" w:sz="1"/>
+            </w:tcBorders>
+            <w:shd w:fill="F2F2F2" w:val="clear"/>
+            <w:tcMar>
+              <w:top w:type="dxa" w:w="90"/>
+              <w:left w:type="dxa" w:w="130"/>
+              <w:bottom w:type="dxa" w:w="90"/>
+              <w:right w:type="dxa" w:w="130"/>
+            </w:tcMar>
+            <w:vAlign w:val="center"/>
+          </w:tcPr>
+          <w:p>
+            <w:pPr>
+              <w:spacing w:after="0" w:line="252"/>
+              <w:jc w:val="right"/>
+            </w:pPr>
+            <w:r>
+              <w:rPr>
+                <w:rFonts w:ascii="Arial" w:cs="Arial" w:eastAsia="Arial" w:hAnsi="Arial"/>
+                <w:b w:val="false"/>
+                <w:bCs w:val="false"/>
+                <w:sz w:val="20"/>
+                <w:szCs w:val="20"/>
+              </w:rPr>
+              <w:t xml:space="preserve">Cuota de USD 10 / mes</w:t>
+            </w:r>
+          </w:p>
+        </w:tc>
+      </w:tr>
+      <w:tr>
+        <w:trPr>
+          <w:tblHeader w:val="off"/>
+        </w:trPr>
+        <w:tc>
+          <w:tcPr>
+            <w:tcW w:type="dxa" w:w="3600"/>
+            <w:tcBorders>
+              <w:top w:val="single" w:color="BFBFBF" w:sz="1"/>
+              <w:left w:val="single" w:color="BFBFBF" w:sz="1"/>
+              <w:bottom w:val="single" w:color="BFBFBF" w:sz="1"/>
+              <w:right w:val="single" w:color="BFBFBF" w:sz="1"/>
+            </w:tcBorders>
+            <w:tcMar>
+              <w:top w:type="dxa" w:w="90"/>
+              <w:left w:type="dxa" w:w="130"/>
+              <w:bottom w:type="dxa" w:w="90"/>
+              <w:right w:type="dxa" w:w="130"/>
+            </w:tcMar>
+            <w:vAlign w:val="center"/>
+          </w:tcPr>
+          <w:p>
+            <w:pPr>
+              <w:spacing w:after="0" w:line="252"/>
+            </w:pPr>
+            <w:r>
+              <w:rPr>
+                <w:rFonts w:ascii="Arial" w:cs="Arial" w:eastAsia="Arial" w:hAnsi="Arial"/>
+                <w:b w:val="false"/>
+                <w:bCs w:val="false"/>
+                <w:sz w:val="20"/>
+                <w:szCs w:val="20"/>
+              </w:rPr>
               <w:t xml:space="preserve">Adicionales por excedente</w:t>
             </w:r>
           </w:p>
@@ -552,7 +625,6 @@
               <w:bottom w:val="single" w:color="BFBFBF" w:sz="1"/>
               <w:right w:val="single" w:color="BFBFBF" w:sz="1"/>
             </w:tcBorders>
-            <w:shd w:fill="F2F2F2" w:val="clear"/>
             <w:tcMar>
               <w:top w:type="dxa" w:w="90"/>
               <w:left w:type="dxa" w:w="130"/>
@@ -600,7 +672,7 @@
           <w:sz w:val="19"/>
           <w:szCs w:val="19"/>
         </w:rPr>
-        <w:t xml:space="preserve">Con contrato de 12 meses abonados por adelantado, la puesta en marcha baja a </w:t>
+        <w:t xml:space="preserve">Los primeros 12 meses van a un precio de lanzamiento, con la puesta en marcha a </w:t>
       </w:r>
       <w:r>
         <w:rPr>
@@ -613,7 +685,7 @@
           <w:sz w:val="19"/>
           <w:szCs w:val="19"/>
         </w:rPr>
-        <w:t xml:space="preserve">ARS 425.000</w:t>
+        <w:t xml:space="preserve">ARS 250.000</w:t>
       </w:r>
       <w:r>
         <w:rPr>
@@ -626,7 +698,7 @@
           <w:sz w:val="19"/>
           <w:szCs w:val="19"/>
         </w:rPr>
-        <w:t xml:space="preserve"> y el primer año de abono tiene un 15% de descuento.</w:t>
+        <w:t xml:space="preserve"> y el resto de las condiciones de esta propuesta. A partir del mes 13, el abono pasa a su precio de lista.</w:t>
       </w:r>
     </w:p>
     <w:p>
@@ -1888,7 +1960,7 @@
                 <w:sz w:val="20"/>
                 <w:szCs w:val="20"/>
               </w:rPr>
-              <w:t xml:space="preserve">1.000 por mes</w:t>
+              <w:t xml:space="preserve">Sin cupo fijo</w:t>
             </w:r>
           </w:p>
         </w:tc>
@@ -1922,7 +1994,7 @@
                 <w:sz w:val="20"/>
                 <w:szCs w:val="20"/>
               </w:rPr>
-              <w:t xml:space="preserve">A costo de plataforma</w:t>
+              <w:t xml:space="preserve">A costo de plataforma, según consumo</w:t>
             </w:r>
           </w:p>
         </w:tc>
@@ -1993,7 +2065,7 @@
                 <w:sz w:val="20"/>
                 <w:szCs w:val="20"/>
               </w:rPr>
-              <w:t xml:space="preserve">USD 30 por mes</w:t>
+              <w:t xml:space="preserve">USD 10 por mes</w:t>
             </w:r>
           </w:p>
         </w:tc>
@@ -2052,7 +2124,7 @@
           <w:sz w:val="19"/>
           <w:szCs w:val="19"/>
         </w:rPr>
-        <w:t xml:space="preserve">El consumo de IA no se estima: el sistema anota cada pedido al proveedor con sus tokens y su costo, aunque la llamada falle. La pantalla de consumo muestra el gasto del mes en curso y del mes anterior, por empresa.</w:t>
+        <w:t xml:space="preserve">El consumo de IA no se estima: el sistema anota cada pedido al proveedor con sus tokens y su costo, aunque la llamada falle. La pantalla de consumo muestra el gasto del mes en curso y del mes anterior, por empresa. Lo mismo ocurre con WhatsApp: el sistema registra cada mensaje enviado con su estado, y el consumo se factura contra ese registro.</w:t>
       </w:r>
     </w:p>
     <w:p>
@@ -2865,7 +2937,7 @@
                 <w:sz w:val="20"/>
                 <w:szCs w:val="20"/>
               </w:rPr>
-              <w:t xml:space="preserve">12 meses. Es el tiempo mínimo para que la puesta en marcha se amortice y el sistema de repuestos y el asistente rendigan.</w:t>
+              <w:t xml:space="preserve">12 meses a precio de lanzamiento. Es el tiempo mínimo para que la puesta en marcha se amortice y el sistema de repuestos y el asistente rendigan.</w:t>
             </w:r>
           </w:p>
         </w:tc>
@@ -2903,7 +2975,7 @@
                 <w:sz w:val="20"/>
                 <w:szCs w:val="20"/>
               </w:rPr>
-              <w:t xml:space="preserve">Forma de pago</w:t>
+              <w:t xml:space="preserve">Precio a partir del mes 13</w:t>
             </w:r>
           </w:p>
         </w:tc>
@@ -2936,7 +3008,7 @@
                 <w:sz w:val="20"/>
                 <w:szCs w:val="20"/>
               </w:rPr>
-              <w:t xml:space="preserve">Mensual, por adelantado, contra factura electrónica (AFIP/ARCA). El abono se emite el primer día de cada mes.</w:t>
+              <w:t xml:space="preserve">Al mes 13 el abono pasa a su precio de lista de ARS 120.000, con el ajuste por IPC correspondiente. Los 12 primeros meses quedan congelados en ARS 30.000.</w:t>
             </w:r>
           </w:p>
         </w:tc>
@@ -2975,7 +3047,7 @@
                 <w:sz w:val="20"/>
                 <w:szCs w:val="20"/>
               </w:rPr>
-              <w:t xml:space="preserve">Bonificaciones</w:t>
+              <w:t xml:space="preserve">Forma de pago</w:t>
             </w:r>
           </w:p>
         </w:tc>
@@ -3009,7 +3081,7 @@
                 <w:sz w:val="20"/>
                 <w:szCs w:val="20"/>
               </w:rPr>
-              <w:t xml:space="preserve">12 meses abonados por adelantado: puesta en marcha a ARS 425.000 y 15% de descuento sobre el abono del primer año.</w:t>
+              <w:t xml:space="preserve">Mensual, por adelantado, contra factura electrónica (AFIP/ARCA). El abono se emite el primer día de cada mes.</w:t>
             </w:r>
           </w:p>
         </w:tc>
@@ -3047,7 +3119,7 @@
                 <w:sz w:val="20"/>
                 <w:szCs w:val="20"/>
               </w:rPr>
-              <w:t xml:space="preserve">Baja</w:t>
+              <w:t xml:space="preserve">Bonificaciones</w:t>
             </w:r>
           </w:p>
         </w:tc>
@@ -3080,7 +3152,7 @@
                 <w:sz w:val="20"/>
                 <w:szCs w:val="20"/>
               </w:rPr>
-              <w:t xml:space="preserve">Preaviso de 60 días. El cliente conserva la exportación de sus datos en formato aberto y el acceso de lectura durante los 90 días siguientes a la baja.</w:t>
+              <w:t xml:space="preserve">12 meses abonados por adelantado: puesta en marcha a ARS 250.000.</w:t>
             </w:r>
           </w:p>
         </w:tc>
@@ -3119,6 +3191,78 @@
                 <w:sz w:val="20"/>
                 <w:szCs w:val="20"/>
               </w:rPr>
+              <w:t xml:space="preserve">Baja</w:t>
+            </w:r>
+          </w:p>
+        </w:tc>
+        <w:tc>
+          <w:tcPr>
+            <w:tcW w:type="dxa" w:w="6638"/>
+            <w:tcBorders>
+              <w:top w:val="single" w:color="BFBFBF" w:sz="1"/>
+              <w:left w:val="single" w:color="BFBFBF" w:sz="1"/>
+              <w:bottom w:val="single" w:color="BFBFBF" w:sz="1"/>
+              <w:right w:val="single" w:color="BFBFBF" w:sz="1"/>
+            </w:tcBorders>
+            <w:shd w:fill="F2F2F2" w:val="clear"/>
+            <w:tcMar>
+              <w:top w:type="dxa" w:w="90"/>
+              <w:left w:type="dxa" w:w="130"/>
+              <w:bottom w:type="dxa" w:w="90"/>
+              <w:right w:type="dxa" w:w="130"/>
+            </w:tcMar>
+            <w:vAlign w:val="center"/>
+          </w:tcPr>
+          <w:p>
+            <w:pPr>
+              <w:spacing w:after="0" w:line="252"/>
+            </w:pPr>
+            <w:r>
+              <w:rPr>
+                <w:rFonts w:ascii="Arial" w:cs="Arial" w:eastAsia="Arial" w:hAnsi="Arial"/>
+                <w:b w:val="false"/>
+                <w:bCs w:val="false"/>
+                <w:sz w:val="20"/>
+                <w:szCs w:val="20"/>
+              </w:rPr>
+              <w:t xml:space="preserve">Preaviso de 60 días. El cliente conserva la exportación de sus datos en formato aberto y el acceso de lectura durante los 90 días siguientes a la baja.</w:t>
+            </w:r>
+          </w:p>
+        </w:tc>
+      </w:tr>
+      <w:tr>
+        <w:trPr>
+          <w:tblHeader w:val="off"/>
+        </w:trPr>
+        <w:tc>
+          <w:tcPr>
+            <w:tcW w:type="dxa" w:w="3000"/>
+            <w:tcBorders>
+              <w:top w:val="single" w:color="BFBFBF" w:sz="1"/>
+              <w:left w:val="single" w:color="BFBFBF" w:sz="1"/>
+              <w:bottom w:val="single" w:color="BFBFBF" w:sz="1"/>
+              <w:right w:val="single" w:color="BFBFBF" w:sz="1"/>
+            </w:tcBorders>
+            <w:tcMar>
+              <w:top w:type="dxa" w:w="90"/>
+              <w:left w:type="dxa" w:w="130"/>
+              <w:bottom w:type="dxa" w:w="90"/>
+              <w:right w:type="dxa" w:w="130"/>
+            </w:tcMar>
+            <w:vAlign w:val="center"/>
+          </w:tcPr>
+          <w:p>
+            <w:pPr>
+              <w:spacing w:after="0" w:line="252"/>
+            </w:pPr>
+            <w:r>
+              <w:rPr>
+                <w:rFonts w:ascii="Arial" w:cs="Arial" w:eastAsia="Arial" w:hAnsi="Arial"/>
+                <w:b w:val="false"/>
+                <w:bCs w:val="false"/>
+                <w:sz w:val="20"/>
+                <w:szCs w:val="20"/>
+              </w:rPr>
               <w:t xml:space="preserve">Propiedad de los datos</w:t>
             </w:r>
           </w:p>
@@ -3132,7 +3276,6 @@
               <w:bottom w:val="single" w:color="BFBFBF" w:sz="1"/>
               <w:right w:val="single" w:color="BFBFBF" w:sz="1"/>
             </w:tcBorders>
-            <w:shd w:fill="F2F2F2" w:val="clear"/>
             <w:tcMar>
               <w:top w:type="dxa" w:w="90"/>
               <w:left w:type="dxa" w:w="130"/>
@@ -3795,7 +3938,30 @@
     </w:tbl>
     <w:p>
       <w:pPr>
-        <w:spacing w:after="160"/>
+        <w:spacing w:after="100"/>
+      </w:pPr>
+    </w:p>
+    <w:p>
+      <w:pPr>
+        <w:spacing w:after="140" w:line="276"/>
+      </w:pPr>
+      <w:r>
+        <w:rPr>
+          <w:rFonts w:ascii="Arial" w:cs="Arial" w:eastAsia="Arial" w:hAnsi="Arial"/>
+          <w:b w:val="false"/>
+          <w:bCs w:val="false"/>
+          <w:i w:val="false"/>
+          <w:iCs w:val="false"/>
+          <w:color w:val="595959"/>
+          <w:sz w:val="19"/>
+          <w:szCs w:val="19"/>
+        </w:rPr>
+        <w:t xml:space="preserve">Estos compromisos se aplican durante los 12 meses a precio de lanzamiento. A partir del mes 13, con el abono a su precio de lista, el SLA se revisa en conjunto con el cliente.</w:t>
+      </w:r>
+    </w:p>
+    <w:p>
+      <w:pPr>
+        <w:spacing w:after="60"/>
       </w:pPr>
     </w:p>
     <w:p>
@@ -3847,7 +4013,7 @@
           <w:sz w:val="21"/>
           <w:szCs w:val="21"/>
         </w:rPr>
-        <w:t xml:space="preserve">Consumo de IA por encima de los USD 30 incluidos: se factura al costo medido de los tokens más un 30%.</w:t>
+        <w:t xml:space="preserve">Consumo de IA por encima de los USD 10 incluidos: se factura al costo medido de los tokens más un 30%.</w:t>
       </w:r>
     </w:p>
     <w:p>
@@ -3865,7 +4031,7 @@
           <w:sz w:val="21"/>
           <w:szCs w:val="21"/>
         </w:rPr>
-        <w:t xml:space="preserve">Conversaciones de WhatsApp por encima de 1.000 por mes: se factura a costo de plataforma.</w:t>
+        <w:t xml:space="preserve">Mensajes de WhatsApp: se facturan a costo de plataforma según el consumo real registrado. Electrotecniref puede usar su propia instancia y su propia línea, con lo que la facturación de Meta le llega directamente.</w:t>
       </w:r>
     </w:p>
     <w:p>

</xml_diff>